<commit_message>
Avances: Proyecto de Practicas Profesionales
</commit_message>
<xml_diff>
--- a/Prácticas Profesionales/Actividad 2.2.docx
+++ b/Prácticas Profesionales/Actividad 2.2.docx
@@ -1,6 +1,6 @@
 
 <file path=word/document.xml><?xml version="1.0" encoding="utf-8"?>
-<w:document xmlns:wpc="http://schemas.microsoft.com/office/word/2010/wordprocessingCanvas" xmlns:mc="http://schemas.openxmlformats.org/markup-compatibility/2006" xmlns:o="urn:schemas-microsoft-com:office:office" xmlns:r="http://schemas.openxmlformats.org/officeDocument/2006/relationships" xmlns:m="http://schemas.openxmlformats.org/officeDocument/2006/math" xmlns:v="urn:schemas-microsoft-com:vml" xmlns:wp14="http://schemas.microsoft.com/office/word/2010/wordprocessingDrawing" xmlns:wp="http://schemas.openxmlformats.org/drawingml/2006/wordprocessingDrawing" xmlns:w10="urn:schemas-microsoft-com:office:word" xmlns:w="http://schemas.openxmlformats.org/wordprocessingml/2006/main" xmlns:w14="http://schemas.microsoft.com/office/word/2010/wordml" xmlns:w15="http://schemas.microsoft.com/office/word/2012/wordml" xmlns:wpg="http://schemas.microsoft.com/office/word/2010/wordprocessingGroup" xmlns:wpi="http://schemas.microsoft.com/office/word/2010/wordprocessingInk" xmlns:wne="http://schemas.microsoft.com/office/word/2006/wordml" xmlns:wps="http://schemas.microsoft.com/office/word/2010/wordprocessingShape" mc:Ignorable="w14 w15 wp14">
+<w:document xmlns:wpc="http://schemas.microsoft.com/office/word/2010/wordprocessingCanvas" xmlns:cx="http://schemas.microsoft.com/office/drawing/2014/chartex" xmlns:cx1="http://schemas.microsoft.com/office/drawing/2015/9/8/chartex" xmlns:cx2="http://schemas.microsoft.com/office/drawing/2015/10/21/chartex" xmlns:cx3="http://schemas.microsoft.com/office/drawing/2016/5/9/chartex" xmlns:cx4="http://schemas.microsoft.com/office/drawing/2016/5/10/chartex" xmlns:cx5="http://schemas.microsoft.com/office/drawing/2016/5/11/chartex" xmlns:cx6="http://schemas.microsoft.com/office/drawing/2016/5/12/chartex" xmlns:cx7="http://schemas.microsoft.com/office/drawing/2016/5/13/chartex" xmlns:cx8="http://schemas.microsoft.com/office/drawing/2016/5/14/chartex" xmlns:mc="http://schemas.openxmlformats.org/markup-compatibility/2006" xmlns:aink="http://schemas.microsoft.com/office/drawing/2016/ink" xmlns:am3d="http://schemas.microsoft.com/office/drawing/2017/model3d" xmlns:o="urn:schemas-microsoft-com:office:office" xmlns:oel="http://schemas.microsoft.com/office/2019/extlst" xmlns:r="http://schemas.openxmlformats.org/officeDocument/2006/relationships" xmlns:m="http://schemas.openxmlformats.org/officeDocument/2006/math" xmlns:v="urn:schemas-microsoft-com:vml" xmlns:wp14="http://schemas.microsoft.com/office/word/2010/wordprocessingDrawing" xmlns:wp="http://schemas.openxmlformats.org/drawingml/2006/wordprocessingDrawing" xmlns:w10="urn:schemas-microsoft-com:office:word" xmlns:w="http://schemas.openxmlformats.org/wordprocessingml/2006/main" xmlns:w14="http://schemas.microsoft.com/office/word/2010/wordml" xmlns:w15="http://schemas.microsoft.com/office/word/2012/wordml" xmlns:w16cex="http://schemas.microsoft.com/office/word/2018/wordml/cex" xmlns:w16cid="http://schemas.microsoft.com/office/word/2016/wordml/cid" xmlns:w16="http://schemas.microsoft.com/office/word/2018/wordml" xmlns:w16du="http://schemas.microsoft.com/office/word/2023/wordml/word16du" xmlns:w16sdtdh="http://schemas.microsoft.com/office/word/2020/wordml/sdtdatahash" xmlns:w16sdtfl="http://schemas.microsoft.com/office/word/2024/wordml/sdtformatlock" xmlns:w16se="http://schemas.microsoft.com/office/word/2015/wordml/symex" xmlns:wpg="http://schemas.microsoft.com/office/word/2010/wordprocessingGroup" xmlns:wpi="http://schemas.microsoft.com/office/word/2010/wordprocessingInk" xmlns:wne="http://schemas.microsoft.com/office/word/2006/wordml" xmlns:wps="http://schemas.microsoft.com/office/word/2010/wordprocessingShape" mc:Ignorable="w14 w15 w16se w16cid w16 w16cex w16sdtdh w16sdtfl w16du wp14">
   <w:body>
     <w:sdt>
       <w:sdtPr>
@@ -10,7 +10,6 @@
           <w:docPartUnique/>
         </w:docPartObj>
       </w:sdtPr>
-      <w:sdtEndPr/>
       <w:sdtContent>
         <w:p>
           <w:r>
@@ -21,7 +20,7 @@
             <mc:AlternateContent>
               <mc:Choice Requires="wpg">
                 <w:drawing>
-                  <wp:anchor distT="0" distB="0" distL="114300" distR="114300" simplePos="0" relativeHeight="251659264" behindDoc="1" locked="0" layoutInCell="1" allowOverlap="1" wp14:anchorId="025B6569" wp14:editId="074E1755">
+                  <wp:anchor distT="0" distB="0" distL="114300" distR="114300" simplePos="0" relativeHeight="251659264" behindDoc="1" locked="0" layoutInCell="1" allowOverlap="1" wp14:anchorId="77F8EA72" wp14:editId="23470F60">
                     <wp:simplePos x="0" y="0"/>
                     <wp:positionH relativeFrom="column">
                       <wp:posOffset>1891672</wp:posOffset>
@@ -490,7 +489,7 @@
                   </wp:anchor>
                 </w:drawing>
               </mc:Choice>
-              <mc:Fallback xmlns:w16se="http://schemas.microsoft.com/office/word/2015/wordml/symex" xmlns:cx="http://schemas.microsoft.com/office/drawing/2014/chartex">
+              <mc:Fallback>
                 <w:pict>
                   <v:group w14:anchorId="2AD74034" id="Grupo 2" o:spid="_x0000_s1026" style="position:absolute;margin-left:148.95pt;margin-top:-34.85pt;width:340.9pt;height:353.65pt;z-index:-251657216" coordsize="43291,44910" o:gfxdata="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">
                     <v:shape id="Forma libre 56" o:spid="_x0000_s1027" style="position:absolute;left:15017;width:28274;height:28352;visibility:visible;mso-wrap-style:square;v-text-anchor:top" coordsize="1781,1786" o:gfxdata="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" path="m4,1786l,1782,1776,r5,5l4,1786xe" filled="f" stroked="f">
@@ -531,7 +530,7 @@
             <mc:AlternateContent>
               <mc:Choice Requires="wps">
                 <w:drawing>
-                  <wp:anchor distT="45720" distB="45720" distL="114300" distR="114300" simplePos="0" relativeHeight="251665408" behindDoc="0" locked="0" layoutInCell="1" allowOverlap="1" wp14:anchorId="74EEC051" wp14:editId="0654E1E9">
+                  <wp:anchor distT="45720" distB="45720" distL="114300" distR="114300" simplePos="0" relativeHeight="251665408" behindDoc="0" locked="0" layoutInCell="1" allowOverlap="1" wp14:anchorId="7825A85E" wp14:editId="57B91DD3">
                     <wp:simplePos x="0" y="0"/>
                     <wp:positionH relativeFrom="page">
                       <wp:posOffset>3054350</wp:posOffset>
@@ -606,11 +605,11 @@
               </mc:Choice>
               <mc:Fallback>
                 <w:pict>
-                  <v:shapetype w14:anchorId="74EEC051" id="_x0000_t202" coordsize="21600,21600" o:spt="202" path="m,l,21600r21600,l21600,xe">
+                  <v:shapetype w14:anchorId="7825A85E" id="_x0000_t202" coordsize="21600,21600" o:spt="202" path="m,l,21600r21600,l21600,xe">
                     <v:stroke joinstyle="miter"/>
                     <v:path gradientshapeok="t" o:connecttype="rect"/>
                   </v:shapetype>
-                  <v:shape id="Cuadro de texto 2" o:spid="_x0000_s1026" type="#_x0000_t202" style="position:absolute;margin-left:240.5pt;margin-top:255.85pt;width:329.8pt;height:37.4pt;z-index:251665408;visibility:visible;mso-wrap-style:square;mso-width-percent:0;mso-height-percent:0;mso-wrap-distance-left:9pt;mso-wrap-distance-top:3.6pt;mso-wrap-distance-right:9pt;mso-wrap-distance-bottom:3.6pt;mso-position-horizontal:absolute;mso-position-horizontal-relative:page;mso-position-vertical:absolute;mso-position-vertical-relative:text;mso-width-percent:0;mso-height-percent:0;mso-width-relative:margin;mso-height-relative:margin;v-text-anchor:top" o:gfxdata="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" filled="f" stroked="f">
+                  <v:shape id="Cuadro de texto 2" o:spid="_x0000_s1026" type="#_x0000_t202" style="position:absolute;margin-left:240.5pt;margin-top:255.85pt;width:329.8pt;height:37.4pt;z-index:251665408;visibility:visible;mso-wrap-style:square;mso-width-percent:0;mso-height-percent:0;mso-wrap-distance-left:9pt;mso-wrap-distance-top:3.6pt;mso-wrap-distance-right:9pt;mso-wrap-distance-bottom:3.6pt;mso-position-horizontal:absolute;mso-position-horizontal-relative:page;mso-position-vertical:absolute;mso-position-vertical-relative:text;mso-width-percent:0;mso-height-percent:0;mso-width-relative:margin;mso-height-relative:margin;v-text-anchor:top" o:gfxdata="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" filled="f" stroked="f">
                     <v:textbox>
                       <w:txbxContent>
                         <w:p>
@@ -646,7 +645,7 @@
             <mc:AlternateContent>
               <mc:Choice Requires="wps">
                 <w:drawing>
-                  <wp:anchor distT="45720" distB="45720" distL="114300" distR="114300" simplePos="0" relativeHeight="251666432" behindDoc="0" locked="0" layoutInCell="1" allowOverlap="1" wp14:anchorId="016B4C24" wp14:editId="0C549FCD">
+                  <wp:anchor distT="45720" distB="45720" distL="114300" distR="114300" simplePos="0" relativeHeight="251666432" behindDoc="0" locked="0" layoutInCell="1" allowOverlap="1" wp14:anchorId="73BA1545" wp14:editId="44CEEE4E">
                     <wp:simplePos x="0" y="0"/>
                     <wp:positionH relativeFrom="margin">
                       <wp:posOffset>1956435</wp:posOffset>
@@ -721,7 +720,7 @@
               </mc:Choice>
               <mc:Fallback>
                 <w:pict>
-                  <v:shape w14:anchorId="016B4C24" id="_x0000_s1027" type="#_x0000_t202" style="position:absolute;margin-left:154.05pt;margin-top:308pt;width:311.8pt;height:30.85pt;z-index:251666432;visibility:visible;mso-wrap-style:square;mso-width-percent:0;mso-height-percent:0;mso-wrap-distance-left:9pt;mso-wrap-distance-top:3.6pt;mso-wrap-distance-right:9pt;mso-wrap-distance-bottom:3.6pt;mso-position-horizontal:absolute;mso-position-horizontal-relative:margin;mso-position-vertical:absolute;mso-position-vertical-relative:text;mso-width-percent:0;mso-height-percent:0;mso-width-relative:margin;mso-height-relative:margin;v-text-anchor:top" o:gfxdata="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" filled="f" stroked="f">
+                  <v:shape w14:anchorId="73BA1545" id="_x0000_s1027" type="#_x0000_t202" style="position:absolute;margin-left:154.05pt;margin-top:308pt;width:311.8pt;height:30.85pt;z-index:251666432;visibility:visible;mso-wrap-style:square;mso-width-percent:0;mso-height-percent:0;mso-wrap-distance-left:9pt;mso-wrap-distance-top:3.6pt;mso-wrap-distance-right:9pt;mso-wrap-distance-bottom:3.6pt;mso-position-horizontal:absolute;mso-position-horizontal-relative:margin;mso-position-vertical:absolute;mso-position-vertical-relative:text;mso-width-percent:0;mso-height-percent:0;mso-width-relative:margin;mso-height-relative:margin;v-text-anchor:top" o:gfxdata="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" filled="f" stroked="f">
                     <v:textbox>
                       <w:txbxContent>
                         <w:p>
@@ -757,7 +756,7 @@
             <mc:AlternateContent>
               <mc:Choice Requires="wps">
                 <w:drawing>
-                  <wp:anchor distT="45720" distB="45720" distL="114300" distR="114300" simplePos="0" relativeHeight="251667456" behindDoc="0" locked="0" layoutInCell="1" allowOverlap="1" wp14:anchorId="25834116" wp14:editId="37649E28">
+                  <wp:anchor distT="45720" distB="45720" distL="114300" distR="114300" simplePos="0" relativeHeight="251667456" behindDoc="0" locked="0" layoutInCell="1" allowOverlap="1" wp14:anchorId="5198F216" wp14:editId="738C2854">
                     <wp:simplePos x="0" y="0"/>
                     <wp:positionH relativeFrom="column">
                       <wp:posOffset>1961333</wp:posOffset>
@@ -832,7 +831,7 @@
               </mc:Choice>
               <mc:Fallback>
                 <w:pict>
-                  <v:shape w14:anchorId="25834116" id="_x0000_s1028" type="#_x0000_t202" style="position:absolute;margin-left:154.45pt;margin-top:362.65pt;width:311.8pt;height:45.3pt;z-index:251667456;visibility:visible;mso-wrap-style:square;mso-width-percent:0;mso-height-percent:0;mso-wrap-distance-left:9pt;mso-wrap-distance-top:3.6pt;mso-wrap-distance-right:9pt;mso-wrap-distance-bottom:3.6pt;mso-position-horizontal:absolute;mso-position-horizontal-relative:text;mso-position-vertical:absolute;mso-position-vertical-relative:text;mso-width-percent:0;mso-height-percent:0;mso-width-relative:margin;mso-height-relative:margin;v-text-anchor:top" o:gfxdata="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" filled="f" stroked="f">
+                  <v:shape w14:anchorId="5198F216" id="_x0000_s1028" type="#_x0000_t202" style="position:absolute;margin-left:154.45pt;margin-top:362.65pt;width:311.8pt;height:45.3pt;z-index:251667456;visibility:visible;mso-wrap-style:square;mso-width-percent:0;mso-height-percent:0;mso-wrap-distance-left:9pt;mso-wrap-distance-top:3.6pt;mso-wrap-distance-right:9pt;mso-wrap-distance-bottom:3.6pt;mso-position-horizontal:absolute;mso-position-horizontal-relative:text;mso-position-vertical:absolute;mso-position-vertical-relative:text;mso-width-percent:0;mso-height-percent:0;mso-width-relative:margin;mso-height-relative:margin;v-text-anchor:top" o:gfxdata="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" filled="f" stroked="f">
                     <v:textbox>
                       <w:txbxContent>
                         <w:p>
@@ -868,7 +867,7 @@
             <mc:AlternateContent>
               <mc:Choice Requires="wps">
                 <w:drawing>
-                  <wp:anchor distT="45720" distB="45720" distL="114300" distR="114300" simplePos="0" relativeHeight="251661312" behindDoc="0" locked="0" layoutInCell="1" allowOverlap="1" wp14:anchorId="2A14265C" wp14:editId="62104DAB">
+                  <wp:anchor distT="45720" distB="45720" distL="114300" distR="114300" simplePos="0" relativeHeight="251661312" behindDoc="0" locked="0" layoutInCell="1" allowOverlap="1" wp14:anchorId="62F425C2" wp14:editId="4B597E6F">
                     <wp:simplePos x="0" y="0"/>
                     <wp:positionH relativeFrom="margin">
                       <wp:align>left</wp:align>
@@ -945,7 +944,7 @@
               </mc:Choice>
               <mc:Fallback>
                 <w:pict>
-                  <v:shape w14:anchorId="2A14265C" id="_x0000_s1029" type="#_x0000_t202" style="position:absolute;margin-left:0;margin-top:245.9pt;width:167.25pt;height:45.3pt;z-index:251661312;visibility:visible;mso-wrap-style:square;mso-width-percent:0;mso-height-percent:0;mso-wrap-distance-left:9pt;mso-wrap-distance-top:3.6pt;mso-wrap-distance-right:9pt;mso-wrap-distance-bottom:3.6pt;mso-position-horizontal:left;mso-position-horizontal-relative:margin;mso-position-vertical:absolute;mso-position-vertical-relative:text;mso-width-percent:0;mso-height-percent:0;mso-width-relative:margin;mso-height-relative:margin;v-text-anchor:top" o:gfxdata="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" filled="f" stroked="f">
+                  <v:shape w14:anchorId="62F425C2" id="_x0000_s1029" type="#_x0000_t202" style="position:absolute;margin-left:0;margin-top:245.9pt;width:167.25pt;height:45.3pt;z-index:251661312;visibility:visible;mso-wrap-style:square;mso-width-percent:0;mso-height-percent:0;mso-wrap-distance-left:9pt;mso-wrap-distance-top:3.6pt;mso-wrap-distance-right:9pt;mso-wrap-distance-bottom:3.6pt;mso-position-horizontal:left;mso-position-horizontal-relative:margin;mso-position-vertical:absolute;mso-position-vertical-relative:text;mso-width-percent:0;mso-height-percent:0;mso-width-relative:margin;mso-height-relative:margin;v-text-anchor:top" o:gfxdata="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" filled="f" stroked="f">
                     <v:textbox>
                       <w:txbxContent>
                         <w:p>
@@ -983,7 +982,7 @@
             <mc:AlternateContent>
               <mc:Choice Requires="wps">
                 <w:drawing>
-                  <wp:anchor distT="45720" distB="45720" distL="114300" distR="114300" simplePos="0" relativeHeight="251662336" behindDoc="0" locked="0" layoutInCell="1" allowOverlap="1" wp14:anchorId="26808671" wp14:editId="2BB2776A">
+                  <wp:anchor distT="45720" distB="45720" distL="114300" distR="114300" simplePos="0" relativeHeight="251662336" behindDoc="0" locked="0" layoutInCell="1" allowOverlap="1" wp14:anchorId="435444F0" wp14:editId="12E57226">
                     <wp:simplePos x="0" y="0"/>
                     <wp:positionH relativeFrom="margin">
                       <wp:align>left</wp:align>
@@ -1060,7 +1059,7 @@
               </mc:Choice>
               <mc:Fallback>
                 <w:pict>
-                  <v:shape w14:anchorId="26808671" id="_x0000_s1030" type="#_x0000_t202" style="position:absolute;margin-left:0;margin-top:298.55pt;width:166.65pt;height:45.3pt;z-index:251662336;visibility:visible;mso-wrap-style:square;mso-width-percent:0;mso-height-percent:0;mso-wrap-distance-left:9pt;mso-wrap-distance-top:3.6pt;mso-wrap-distance-right:9pt;mso-wrap-distance-bottom:3.6pt;mso-position-horizontal:left;mso-position-horizontal-relative:margin;mso-position-vertical:absolute;mso-position-vertical-relative:text;mso-width-percent:0;mso-height-percent:0;mso-width-relative:margin;mso-height-relative:margin;v-text-anchor:top" o:gfxdata="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" filled="f" stroked="f">
+                  <v:shape w14:anchorId="435444F0" id="_x0000_s1030" type="#_x0000_t202" style="position:absolute;margin-left:0;margin-top:298.55pt;width:166.65pt;height:45.3pt;z-index:251662336;visibility:visible;mso-wrap-style:square;mso-width-percent:0;mso-height-percent:0;mso-wrap-distance-left:9pt;mso-wrap-distance-top:3.6pt;mso-wrap-distance-right:9pt;mso-wrap-distance-bottom:3.6pt;mso-position-horizontal:left;mso-position-horizontal-relative:margin;mso-position-vertical:absolute;mso-position-vertical-relative:text;mso-width-percent:0;mso-height-percent:0;mso-width-relative:margin;mso-height-relative:margin;v-text-anchor:top" o:gfxdata="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" filled="f" stroked="f">
                     <v:textbox>
                       <w:txbxContent>
                         <w:p>
@@ -1098,7 +1097,7 @@
             <mc:AlternateContent>
               <mc:Choice Requires="wps">
                 <w:drawing>
-                  <wp:anchor distT="45720" distB="45720" distL="114300" distR="114300" simplePos="0" relativeHeight="251663360" behindDoc="0" locked="0" layoutInCell="1" allowOverlap="1" wp14:anchorId="789BF997" wp14:editId="12C31F21">
+                  <wp:anchor distT="45720" distB="45720" distL="114300" distR="114300" simplePos="0" relativeHeight="251663360" behindDoc="0" locked="0" layoutInCell="1" allowOverlap="1" wp14:anchorId="0758CFCF" wp14:editId="7528EDEB">
                     <wp:simplePos x="0" y="0"/>
                     <wp:positionH relativeFrom="margin">
                       <wp:align>left</wp:align>
@@ -1175,7 +1174,7 @@
               </mc:Choice>
               <mc:Fallback>
                 <w:pict>
-                  <v:shape w14:anchorId="789BF997" id="_x0000_s1031" type="#_x0000_t202" style="position:absolute;margin-left:0;margin-top:347.1pt;width:166.65pt;height:45.3pt;z-index:251663360;visibility:visible;mso-wrap-style:square;mso-width-percent:0;mso-height-percent:0;mso-wrap-distance-left:9pt;mso-wrap-distance-top:3.6pt;mso-wrap-distance-right:9pt;mso-wrap-distance-bottom:3.6pt;mso-position-horizontal:left;mso-position-horizontal-relative:margin;mso-position-vertical:absolute;mso-position-vertical-relative:text;mso-width-percent:0;mso-height-percent:0;mso-width-relative:margin;mso-height-relative:margin;v-text-anchor:top" o:gfxdata="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" filled="f" stroked="f">
+                  <v:shape w14:anchorId="0758CFCF" id="_x0000_s1031" type="#_x0000_t202" style="position:absolute;margin-left:0;margin-top:347.1pt;width:166.65pt;height:45.3pt;z-index:251663360;visibility:visible;mso-wrap-style:square;mso-width-percent:0;mso-height-percent:0;mso-wrap-distance-left:9pt;mso-wrap-distance-top:3.6pt;mso-wrap-distance-right:9pt;mso-wrap-distance-bottom:3.6pt;mso-position-horizontal:left;mso-position-horizontal-relative:margin;mso-position-vertical:absolute;mso-position-vertical-relative:text;mso-width-percent:0;mso-height-percent:0;mso-width-relative:margin;mso-height-relative:margin;v-text-anchor:top" o:gfxdata="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" filled="f" stroked="f">
                     <v:textbox>
                       <w:txbxContent>
                         <w:p>
@@ -1211,7 +1210,7 @@
               <w:lang w:eastAsia="es-MX"/>
             </w:rPr>
             <w:drawing>
-              <wp:anchor distT="0" distB="0" distL="114300" distR="114300" simplePos="0" relativeHeight="251660288" behindDoc="1" locked="0" layoutInCell="1" allowOverlap="1" wp14:anchorId="628DDF79" wp14:editId="77C2FE6B">
+              <wp:anchor distT="0" distB="0" distL="114300" distR="114300" simplePos="0" relativeHeight="251660288" behindDoc="1" locked="0" layoutInCell="1" allowOverlap="1" wp14:anchorId="3E3C59A4" wp14:editId="2C47B96D">
                 <wp:simplePos x="0" y="0"/>
                 <wp:positionH relativeFrom="page">
                   <wp:align>right</wp:align>
@@ -1274,7 +1273,7 @@
             <mc:AlternateContent>
               <mc:Choice Requires="wps">
                 <w:drawing>
-                  <wp:anchor distT="45720" distB="45720" distL="114300" distR="114300" simplePos="0" relativeHeight="251674624" behindDoc="0" locked="0" layoutInCell="1" allowOverlap="1" wp14:anchorId="0EA74A6E" wp14:editId="42DF25AB">
+                  <wp:anchor distT="45720" distB="45720" distL="114300" distR="114300" simplePos="0" relativeHeight="251674624" behindDoc="0" locked="0" layoutInCell="1" allowOverlap="1" wp14:anchorId="56A16410" wp14:editId="08888F02">
                     <wp:simplePos x="0" y="0"/>
                     <wp:positionH relativeFrom="page">
                       <wp:posOffset>3020060</wp:posOffset>
@@ -1349,7 +1348,7 @@
               </mc:Choice>
               <mc:Fallback>
                 <w:pict>
-                  <v:shape w14:anchorId="0EA74A6E" id="_x0000_s1032" type="#_x0000_t202" style="position:absolute;margin-left:237.8pt;margin-top:565.4pt;width:311.8pt;height:45.3pt;z-index:251674624;visibility:visible;mso-wrap-style:square;mso-width-percent:0;mso-height-percent:0;mso-wrap-distance-left:9pt;mso-wrap-distance-top:3.6pt;mso-wrap-distance-right:9pt;mso-wrap-distance-bottom:3.6pt;mso-position-horizontal:absolute;mso-position-horizontal-relative:page;mso-position-vertical:absolute;mso-position-vertical-relative:text;mso-width-percent:0;mso-height-percent:0;mso-width-relative:margin;mso-height-relative:margin;v-text-anchor:top" o:gfxdata="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" filled="f" stroked="f">
+                  <v:shape w14:anchorId="56A16410" id="_x0000_s1032" type="#_x0000_t202" style="position:absolute;margin-left:237.8pt;margin-top:565.4pt;width:311.8pt;height:45.3pt;z-index:251674624;visibility:visible;mso-wrap-style:square;mso-width-percent:0;mso-height-percent:0;mso-wrap-distance-left:9pt;mso-wrap-distance-top:3.6pt;mso-wrap-distance-right:9pt;mso-wrap-distance-bottom:3.6pt;mso-position-horizontal:absolute;mso-position-horizontal-relative:page;mso-position-vertical:absolute;mso-position-vertical-relative:text;mso-width-percent:0;mso-height-percent:0;mso-width-relative:margin;mso-height-relative:margin;v-text-anchor:top" o:gfxdata="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" filled="f" stroked="f">
                     <v:textbox>
                       <w:txbxContent>
                         <w:p>
@@ -1385,7 +1384,7 @@
             <mc:AlternateContent>
               <mc:Choice Requires="wps">
                 <w:drawing>
-                  <wp:anchor distT="45720" distB="45720" distL="114300" distR="114300" simplePos="0" relativeHeight="251673600" behindDoc="0" locked="0" layoutInCell="1" allowOverlap="1" wp14:anchorId="05B4E472" wp14:editId="07AC9C4B">
+                  <wp:anchor distT="45720" distB="45720" distL="114300" distR="114300" simplePos="0" relativeHeight="251673600" behindDoc="0" locked="0" layoutInCell="1" allowOverlap="1" wp14:anchorId="79E3075B" wp14:editId="159E20C7">
                     <wp:simplePos x="0" y="0"/>
                     <wp:positionH relativeFrom="page">
                       <wp:posOffset>3017520</wp:posOffset>
@@ -1460,7 +1459,7 @@
               </mc:Choice>
               <mc:Fallback>
                 <w:pict>
-                  <v:shape w14:anchorId="05B4E472" id="_x0000_s1033" type="#_x0000_t202" style="position:absolute;margin-left:237.6pt;margin-top:514.3pt;width:349.2pt;height:45.3pt;z-index:251673600;visibility:visible;mso-wrap-style:square;mso-width-percent:0;mso-height-percent:0;mso-wrap-distance-left:9pt;mso-wrap-distance-top:3.6pt;mso-wrap-distance-right:9pt;mso-wrap-distance-bottom:3.6pt;mso-position-horizontal:absolute;mso-position-horizontal-relative:page;mso-position-vertical:absolute;mso-position-vertical-relative:text;mso-width-percent:0;mso-height-percent:0;mso-width-relative:margin;mso-height-relative:margin;v-text-anchor:top" o:gfxdata="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" filled="f" stroked="f">
+                  <v:shape w14:anchorId="79E3075B" id="_x0000_s1033" type="#_x0000_t202" style="position:absolute;margin-left:237.6pt;margin-top:514.3pt;width:349.2pt;height:45.3pt;z-index:251673600;visibility:visible;mso-wrap-style:square;mso-width-percent:0;mso-height-percent:0;mso-wrap-distance-left:9pt;mso-wrap-distance-top:3.6pt;mso-wrap-distance-right:9pt;mso-wrap-distance-bottom:3.6pt;mso-position-horizontal:absolute;mso-position-horizontal-relative:page;mso-position-vertical:absolute;mso-position-vertical-relative:text;mso-width-percent:0;mso-height-percent:0;mso-width-relative:margin;mso-height-relative:margin;v-text-anchor:top" o:gfxdata="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" filled="f" stroked="f">
                     <v:textbox>
                       <w:txbxContent>
                         <w:p>
@@ -1496,7 +1495,7 @@
             <mc:AlternateContent>
               <mc:Choice Requires="wps">
                 <w:drawing>
-                  <wp:anchor distT="45720" distB="45720" distL="114300" distR="114300" simplePos="0" relativeHeight="251668480" behindDoc="0" locked="0" layoutInCell="1" allowOverlap="1" wp14:anchorId="03F4A98A" wp14:editId="5C18C0C3">
+                  <wp:anchor distT="45720" distB="45720" distL="114300" distR="114300" simplePos="0" relativeHeight="251668480" behindDoc="0" locked="0" layoutInCell="1" allowOverlap="1" wp14:anchorId="6E5C295D" wp14:editId="60ABC207">
                     <wp:simplePos x="0" y="0"/>
                     <wp:positionH relativeFrom="page">
                       <wp:posOffset>3020060</wp:posOffset>
@@ -1571,7 +1570,7 @@
               </mc:Choice>
               <mc:Fallback>
                 <w:pict>
-                  <v:shape w14:anchorId="03F4A98A" id="_x0000_s1034" type="#_x0000_t202" style="position:absolute;margin-left:237.8pt;margin-top:456.1pt;width:311.8pt;height:45.3pt;z-index:251668480;visibility:visible;mso-wrap-style:square;mso-width-percent:0;mso-height-percent:0;mso-wrap-distance-left:9pt;mso-wrap-distance-top:3.6pt;mso-wrap-distance-right:9pt;mso-wrap-distance-bottom:3.6pt;mso-position-horizontal:absolute;mso-position-horizontal-relative:page;mso-position-vertical:absolute;mso-position-vertical-relative:text;mso-width-percent:0;mso-height-percent:0;mso-width-relative:margin;mso-height-relative:margin;v-text-anchor:top" o:gfxdata="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" filled="f" stroked="f">
+                  <v:shape w14:anchorId="6E5C295D" id="_x0000_s1034" type="#_x0000_t202" style="position:absolute;margin-left:237.8pt;margin-top:456.1pt;width:311.8pt;height:45.3pt;z-index:251668480;visibility:visible;mso-wrap-style:square;mso-width-percent:0;mso-height-percent:0;mso-wrap-distance-left:9pt;mso-wrap-distance-top:3.6pt;mso-wrap-distance-right:9pt;mso-wrap-distance-bottom:3.6pt;mso-position-horizontal:absolute;mso-position-horizontal-relative:page;mso-position-vertical:absolute;mso-position-vertical-relative:text;mso-width-percent:0;mso-height-percent:0;mso-width-relative:margin;mso-height-relative:margin;v-text-anchor:top" o:gfxdata="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" filled="f" stroked="f">
                     <v:textbox>
                       <w:txbxContent>
                         <w:p>
@@ -1607,7 +1606,7 @@
             <mc:AlternateContent>
               <mc:Choice Requires="wps">
                 <w:drawing>
-                  <wp:anchor distT="45720" distB="45720" distL="114300" distR="114300" simplePos="0" relativeHeight="251677696" behindDoc="0" locked="0" layoutInCell="1" allowOverlap="1" wp14:anchorId="3CA7EA6F" wp14:editId="10D965E4">
+                  <wp:anchor distT="45720" distB="45720" distL="114300" distR="114300" simplePos="0" relativeHeight="251677696" behindDoc="0" locked="0" layoutInCell="1" allowOverlap="1" wp14:anchorId="383F8074" wp14:editId="772FA9EB">
                     <wp:simplePos x="0" y="0"/>
                     <wp:positionH relativeFrom="page">
                       <wp:posOffset>3020060</wp:posOffset>
@@ -1682,7 +1681,7 @@
               </mc:Choice>
               <mc:Fallback>
                 <w:pict>
-                  <v:shape w14:anchorId="3CA7EA6F" id="_x0000_s1035" type="#_x0000_t202" style="position:absolute;margin-left:237.8pt;margin-top:406.7pt;width:311.8pt;height:45.3pt;z-index:251677696;visibility:visible;mso-wrap-style:square;mso-width-percent:0;mso-height-percent:0;mso-wrap-distance-left:9pt;mso-wrap-distance-top:3.6pt;mso-wrap-distance-right:9pt;mso-wrap-distance-bottom:3.6pt;mso-position-horizontal:absolute;mso-position-horizontal-relative:page;mso-position-vertical:absolute;mso-position-vertical-relative:text;mso-width-percent:0;mso-height-percent:0;mso-width-relative:margin;mso-height-relative:margin;v-text-anchor:top" o:gfxdata="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" filled="f" stroked="f">
+                  <v:shape w14:anchorId="383F8074" id="_x0000_s1035" type="#_x0000_t202" style="position:absolute;margin-left:237.8pt;margin-top:406.7pt;width:311.8pt;height:45.3pt;z-index:251677696;visibility:visible;mso-wrap-style:square;mso-width-percent:0;mso-height-percent:0;mso-wrap-distance-left:9pt;mso-wrap-distance-top:3.6pt;mso-wrap-distance-right:9pt;mso-wrap-distance-bottom:3.6pt;mso-position-horizontal:absolute;mso-position-horizontal-relative:page;mso-position-vertical:absolute;mso-position-vertical-relative:text;mso-width-percent:0;mso-height-percent:0;mso-width-relative:margin;mso-height-relative:margin;v-text-anchor:top" o:gfxdata="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" filled="f" stroked="f">
                     <v:textbox>
                       <w:txbxContent>
                         <w:p>
@@ -1718,7 +1717,7 @@
             <mc:AlternateContent>
               <mc:Choice Requires="wps">
                 <w:drawing>
-                  <wp:anchor distT="45720" distB="45720" distL="114300" distR="114300" simplePos="0" relativeHeight="251676672" behindDoc="0" locked="0" layoutInCell="1" allowOverlap="1" wp14:anchorId="7F268CD4" wp14:editId="04F59948">
+                  <wp:anchor distT="45720" distB="45720" distL="114300" distR="114300" simplePos="0" relativeHeight="251676672" behindDoc="0" locked="0" layoutInCell="1" allowOverlap="1" wp14:anchorId="7A969D05" wp14:editId="7F12C45F">
                     <wp:simplePos x="0" y="0"/>
                     <wp:positionH relativeFrom="margin">
                       <wp:align>left</wp:align>
@@ -1795,7 +1794,7 @@
               </mc:Choice>
               <mc:Fallback>
                 <w:pict>
-                  <v:shape w14:anchorId="7F268CD4" id="_x0000_s1036" type="#_x0000_t202" style="position:absolute;margin-left:0;margin-top:397.15pt;width:166.65pt;height:45.3pt;z-index:251676672;visibility:visible;mso-wrap-style:square;mso-width-percent:0;mso-height-percent:0;mso-wrap-distance-left:9pt;mso-wrap-distance-top:3.6pt;mso-wrap-distance-right:9pt;mso-wrap-distance-bottom:3.6pt;mso-position-horizontal:left;mso-position-horizontal-relative:margin;mso-position-vertical:absolute;mso-position-vertical-relative:text;mso-width-percent:0;mso-height-percent:0;mso-width-relative:margin;mso-height-relative:margin;v-text-anchor:top" o:gfxdata="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" filled="f" stroked="f">
+                  <v:shape w14:anchorId="7A969D05" id="_x0000_s1036" type="#_x0000_t202" style="position:absolute;margin-left:0;margin-top:397.15pt;width:166.65pt;height:45.3pt;z-index:251676672;visibility:visible;mso-wrap-style:square;mso-width-percent:0;mso-height-percent:0;mso-wrap-distance-left:9pt;mso-wrap-distance-top:3.6pt;mso-wrap-distance-right:9pt;mso-wrap-distance-bottom:3.6pt;mso-position-horizontal:left;mso-position-horizontal-relative:margin;mso-position-vertical:absolute;mso-position-vertical-relative:text;mso-width-percent:0;mso-height-percent:0;mso-width-relative:margin;mso-height-relative:margin;v-text-anchor:top" o:gfxdata="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" filled="f" stroked="f">
                     <v:textbox>
                       <w:txbxContent>
                         <w:p>
@@ -1833,7 +1832,7 @@
             <mc:AlternateContent>
               <mc:Choice Requires="wps">
                 <w:drawing>
-                  <wp:anchor distT="45720" distB="45720" distL="114300" distR="114300" simplePos="0" relativeHeight="251664384" behindDoc="0" locked="0" layoutInCell="1" allowOverlap="1" wp14:anchorId="5D0600CC" wp14:editId="4A59814D">
+                  <wp:anchor distT="45720" distB="45720" distL="114300" distR="114300" simplePos="0" relativeHeight="251664384" behindDoc="0" locked="0" layoutInCell="1" allowOverlap="1" wp14:anchorId="0E045E96" wp14:editId="58AD4D86">
                     <wp:simplePos x="0" y="0"/>
                     <wp:positionH relativeFrom="margin">
                       <wp:align>left</wp:align>
@@ -1910,7 +1909,7 @@
               </mc:Choice>
               <mc:Fallback>
                 <w:pict>
-                  <v:shape w14:anchorId="5D0600CC" id="_x0000_s1037" type="#_x0000_t202" style="position:absolute;margin-left:0;margin-top:454.3pt;width:166.65pt;height:50.4pt;z-index:251664384;visibility:visible;mso-wrap-style:square;mso-width-percent:0;mso-height-percent:0;mso-wrap-distance-left:9pt;mso-wrap-distance-top:3.6pt;mso-wrap-distance-right:9pt;mso-wrap-distance-bottom:3.6pt;mso-position-horizontal:left;mso-position-horizontal-relative:margin;mso-position-vertical:absolute;mso-position-vertical-relative:text;mso-width-percent:0;mso-height-percent:0;mso-width-relative:margin;mso-height-relative:margin;v-text-anchor:top" o:gfxdata="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" filled="f" stroked="f">
+                  <v:shape w14:anchorId="0E045E96" id="_x0000_s1037" type="#_x0000_t202" style="position:absolute;margin-left:0;margin-top:454.3pt;width:166.65pt;height:50.4pt;z-index:251664384;visibility:visible;mso-wrap-style:square;mso-width-percent:0;mso-height-percent:0;mso-wrap-distance-left:9pt;mso-wrap-distance-top:3.6pt;mso-wrap-distance-right:9pt;mso-wrap-distance-bottom:3.6pt;mso-position-horizontal:left;mso-position-horizontal-relative:margin;mso-position-vertical:absolute;mso-position-vertical-relative:text;mso-width-percent:0;mso-height-percent:0;mso-width-relative:margin;mso-height-relative:margin;v-text-anchor:top" o:gfxdata="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" filled="f" stroked="f">
                     <v:textbox>
                       <w:txbxContent>
                         <w:p>
@@ -1948,7 +1947,7 @@
             <mc:AlternateContent>
               <mc:Choice Requires="wps">
                 <w:drawing>
-                  <wp:anchor distT="45720" distB="45720" distL="114300" distR="114300" simplePos="0" relativeHeight="251671552" behindDoc="0" locked="0" layoutInCell="1" allowOverlap="1" wp14:anchorId="66C25617" wp14:editId="486D9881">
+                  <wp:anchor distT="45720" distB="45720" distL="114300" distR="114300" simplePos="0" relativeHeight="251671552" behindDoc="0" locked="0" layoutInCell="1" allowOverlap="1" wp14:anchorId="0B83EDE4" wp14:editId="5F49FFFE">
                     <wp:simplePos x="0" y="0"/>
                     <wp:positionH relativeFrom="margin">
                       <wp:posOffset>18011</wp:posOffset>
@@ -2034,7 +2033,7 @@
               </mc:Choice>
               <mc:Fallback>
                 <w:pict>
-                  <v:shape w14:anchorId="66C25617" id="_x0000_s1038" type="#_x0000_t202" style="position:absolute;margin-left:1.4pt;margin-top:558.25pt;width:102pt;height:52.6pt;z-index:251671552;visibility:visible;mso-wrap-style:square;mso-width-percent:0;mso-height-percent:0;mso-wrap-distance-left:9pt;mso-wrap-distance-top:3.6pt;mso-wrap-distance-right:9pt;mso-wrap-distance-bottom:3.6pt;mso-position-horizontal:absolute;mso-position-horizontal-relative:margin;mso-position-vertical:absolute;mso-position-vertical-relative:text;mso-width-percent:0;mso-height-percent:0;mso-width-relative:margin;mso-height-relative:margin;v-text-anchor:top" o:gfxdata="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" filled="f" stroked="f">
+                  <v:shape w14:anchorId="0B83EDE4" id="_x0000_s1038" type="#_x0000_t202" style="position:absolute;margin-left:1.4pt;margin-top:558.25pt;width:102pt;height:52.6pt;z-index:251671552;visibility:visible;mso-wrap-style:square;mso-width-percent:0;mso-height-percent:0;mso-wrap-distance-left:9pt;mso-wrap-distance-top:3.6pt;mso-wrap-distance-right:9pt;mso-wrap-distance-bottom:3.6pt;mso-position-horizontal:absolute;mso-position-horizontal-relative:margin;mso-position-vertical:absolute;mso-position-vertical-relative:text;mso-width-percent:0;mso-height-percent:0;mso-width-relative:margin;mso-height-relative:margin;v-text-anchor:top" o:gfxdata="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" filled="f" stroked="f">
                     <v:textbox>
                       <w:txbxContent>
                         <w:p>
@@ -2081,7 +2080,7 @@
             <mc:AlternateContent>
               <mc:Choice Requires="wps">
                 <w:drawing>
-                  <wp:anchor distT="45720" distB="45720" distL="114300" distR="114300" simplePos="0" relativeHeight="251672576" behindDoc="0" locked="0" layoutInCell="1" allowOverlap="1" wp14:anchorId="2F807923" wp14:editId="6EB3F93F">
+                  <wp:anchor distT="45720" distB="45720" distL="114300" distR="114300" simplePos="0" relativeHeight="251672576" behindDoc="0" locked="0" layoutInCell="1" allowOverlap="1" wp14:anchorId="34EEAE02" wp14:editId="43964A6F">
                     <wp:simplePos x="0" y="0"/>
                     <wp:positionH relativeFrom="margin">
                       <wp:align>left</wp:align>
@@ -2158,7 +2157,7 @@
               </mc:Choice>
               <mc:Fallback>
                 <w:pict>
-                  <v:shape w14:anchorId="2F807923" id="_x0000_s1039" type="#_x0000_t202" style="position:absolute;margin-left:0;margin-top:505.55pt;width:166.65pt;height:45.3pt;z-index:251672576;visibility:visible;mso-wrap-style:square;mso-width-percent:0;mso-height-percent:0;mso-wrap-distance-left:9pt;mso-wrap-distance-top:3.6pt;mso-wrap-distance-right:9pt;mso-wrap-distance-bottom:3.6pt;mso-position-horizontal:left;mso-position-horizontal-relative:margin;mso-position-vertical:absolute;mso-position-vertical-relative:text;mso-width-percent:0;mso-height-percent:0;mso-width-relative:margin;mso-height-relative:margin;v-text-anchor:top" o:gfxdata="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" filled="f" stroked="f">
+                  <v:shape w14:anchorId="34EEAE02" id="_x0000_s1039" type="#_x0000_t202" style="position:absolute;margin-left:0;margin-top:505.55pt;width:166.65pt;height:45.3pt;z-index:251672576;visibility:visible;mso-wrap-style:square;mso-width-percent:0;mso-height-percent:0;mso-wrap-distance-left:9pt;mso-wrap-distance-top:3.6pt;mso-wrap-distance-right:9pt;mso-wrap-distance-bottom:3.6pt;mso-position-horizontal:left;mso-position-horizontal-relative:margin;mso-position-vertical:absolute;mso-position-vertical-relative:text;mso-width-percent:0;mso-height-percent:0;mso-width-relative:margin;mso-height-relative:margin;v-text-anchor:top" o:gfxdata="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" filled="f" stroked="f">
                     <v:textbox>
                       <w:txbxContent>
                         <w:p>
@@ -2206,7 +2205,7 @@
             <mc:AlternateContent>
               <mc:Choice Requires="wps">
                 <w:drawing>
-                  <wp:anchor distT="45720" distB="45720" distL="114300" distR="114300" simplePos="0" relativeHeight="251670528" behindDoc="0" locked="0" layoutInCell="1" allowOverlap="1" wp14:anchorId="45B859D9" wp14:editId="4C5BB2FF">
+                  <wp:anchor distT="45720" distB="45720" distL="114300" distR="114300" simplePos="0" relativeHeight="251670528" behindDoc="0" locked="0" layoutInCell="1" allowOverlap="1" wp14:anchorId="77B257A4" wp14:editId="0FD92E2F">
                     <wp:simplePos x="0" y="0"/>
                     <wp:positionH relativeFrom="margin">
                       <wp:posOffset>857885</wp:posOffset>
@@ -2284,7 +2283,7 @@
               </mc:Choice>
               <mc:Fallback>
                 <w:pict>
-                  <v:shape w14:anchorId="45B859D9" id="_x0000_s1040" type="#_x0000_t202" style="position:absolute;margin-left:67.55pt;margin-top:128pt;width:345.3pt;height:45.3pt;z-index:251670528;visibility:visible;mso-wrap-style:square;mso-width-percent:0;mso-height-percent:0;mso-wrap-distance-left:9pt;mso-wrap-distance-top:3.6pt;mso-wrap-distance-right:9pt;mso-wrap-distance-bottom:3.6pt;mso-position-horizontal:absolute;mso-position-horizontal-relative:margin;mso-position-vertical:absolute;mso-position-vertical-relative:text;mso-width-percent:0;mso-height-percent:0;mso-width-relative:margin;mso-height-relative:margin;v-text-anchor:top" o:gfxdata="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" filled="f" stroked="f">
+                  <v:shape w14:anchorId="77B257A4" id="_x0000_s1040" type="#_x0000_t202" style="position:absolute;margin-left:67.55pt;margin-top:128pt;width:345.3pt;height:45.3pt;z-index:251670528;visibility:visible;mso-wrap-style:square;mso-width-percent:0;mso-height-percent:0;mso-wrap-distance-left:9pt;mso-wrap-distance-top:3.6pt;mso-wrap-distance-right:9pt;mso-wrap-distance-bottom:3.6pt;mso-position-horizontal:absolute;mso-position-horizontal-relative:margin;mso-position-vertical:absolute;mso-position-vertical-relative:text;mso-width-percent:0;mso-height-percent:0;mso-width-relative:margin;mso-height-relative:margin;v-text-anchor:top" o:gfxdata="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" filled="f" stroked="f">
                     <v:textbox>
                       <w:txbxContent>
                         <w:p>
@@ -2323,7 +2322,7 @@
             <mc:AlternateContent>
               <mc:Choice Requires="wps">
                 <w:drawing>
-                  <wp:anchor distT="45720" distB="45720" distL="114300" distR="114300" simplePos="0" relativeHeight="251669504" behindDoc="0" locked="0" layoutInCell="1" allowOverlap="1" wp14:anchorId="59E1D579" wp14:editId="47C75944">
+                  <wp:anchor distT="45720" distB="45720" distL="114300" distR="114300" simplePos="0" relativeHeight="251669504" behindDoc="0" locked="0" layoutInCell="1" allowOverlap="1" wp14:anchorId="19CD8171" wp14:editId="7BEB80A6">
                     <wp:simplePos x="0" y="0"/>
                     <wp:positionH relativeFrom="margin">
                       <wp:posOffset>913130</wp:posOffset>
@@ -2403,7 +2402,7 @@
               </mc:Choice>
               <mc:Fallback>
                 <w:pict>
-                  <v:shape w14:anchorId="59E1D579" id="_x0000_s1041" type="#_x0000_t202" style="position:absolute;margin-left:71.9pt;margin-top:105.4pt;width:345.3pt;height:45.3pt;z-index:251669504;visibility:visible;mso-wrap-style:square;mso-width-percent:0;mso-height-percent:0;mso-wrap-distance-left:9pt;mso-wrap-distance-top:3.6pt;mso-wrap-distance-right:9pt;mso-wrap-distance-bottom:3.6pt;mso-position-horizontal:absolute;mso-position-horizontal-relative:margin;mso-position-vertical:absolute;mso-position-vertical-relative:text;mso-width-percent:0;mso-height-percent:0;mso-width-relative:margin;mso-height-relative:margin;v-text-anchor:top" o:gfxdata="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" filled="f" stroked="f">
+                  <v:shape w14:anchorId="19CD8171" id="_x0000_s1041" type="#_x0000_t202" style="position:absolute;margin-left:71.9pt;margin-top:105.4pt;width:345.3pt;height:45.3pt;z-index:251669504;visibility:visible;mso-wrap-style:square;mso-width-percent:0;mso-height-percent:0;mso-wrap-distance-left:9pt;mso-wrap-distance-top:3.6pt;mso-wrap-distance-right:9pt;mso-wrap-distance-bottom:3.6pt;mso-position-horizontal:absolute;mso-position-horizontal-relative:margin;mso-position-vertical:absolute;mso-position-vertical-relative:text;mso-width-percent:0;mso-height-percent:0;mso-width-relative:margin;mso-height-relative:margin;v-text-anchor:top" o:gfxdata="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" filled="f" stroked="f">
                     <v:textbox>
                       <w:txbxContent>
                         <w:p>
@@ -2444,7 +2443,7 @@
             <mc:AlternateContent>
               <mc:Choice Requires="wps">
                 <w:drawing>
-                  <wp:anchor distT="45720" distB="45720" distL="114300" distR="114300" simplePos="0" relativeHeight="251675648" behindDoc="0" locked="0" layoutInCell="1" allowOverlap="1" wp14:anchorId="096DD54F" wp14:editId="559CEF12">
+                  <wp:anchor distT="45720" distB="45720" distL="114300" distR="114300" simplePos="0" relativeHeight="251675648" behindDoc="0" locked="0" layoutInCell="1" allowOverlap="1" wp14:anchorId="14B34DC7" wp14:editId="3DBB8D4E">
                     <wp:simplePos x="0" y="0"/>
                     <wp:positionH relativeFrom="margin">
                       <wp:align>center</wp:align>
@@ -2529,7 +2528,7 @@
               </mc:Choice>
               <mc:Fallback>
                 <w:pict>
-                  <v:shape w14:anchorId="096DD54F" id="_x0000_s1042" type="#_x0000_t202" style="position:absolute;margin-left:0;margin-top:598.9pt;width:243.6pt;height:32.4pt;z-index:251675648;visibility:visible;mso-wrap-style:square;mso-width-percent:0;mso-height-percent:0;mso-wrap-distance-left:9pt;mso-wrap-distance-top:3.6pt;mso-wrap-distance-right:9pt;mso-wrap-distance-bottom:3.6pt;mso-position-horizontal:center;mso-position-horizontal-relative:margin;mso-position-vertical:absolute;mso-position-vertical-relative:text;mso-width-percent:0;mso-height-percent:0;mso-width-relative:margin;mso-height-relative:margin;v-text-anchor:top" o:gfxdata="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" filled="f" stroked="f">
+                  <v:shape w14:anchorId="14B34DC7" id="_x0000_s1042" type="#_x0000_t202" style="position:absolute;margin-left:0;margin-top:598.9pt;width:243.6pt;height:32.4pt;z-index:251675648;visibility:visible;mso-wrap-style:square;mso-width-percent:0;mso-height-percent:0;mso-wrap-distance-left:9pt;mso-wrap-distance-top:3.6pt;mso-wrap-distance-right:9pt;mso-wrap-distance-bottom:3.6pt;mso-position-horizontal:center;mso-position-horizontal-relative:margin;mso-position-vertical:absolute;mso-position-vertical-relative:text;mso-width-percent:0;mso-height-percent:0;mso-width-relative:margin;mso-height-relative:margin;v-text-anchor:top" o:gfxdata="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" filled="f" stroked="f">
                     <v:textbox>
                       <w:txbxContent>
                         <w:p>
@@ -2662,7 +2661,10 @@
         <w:t>base</w:t>
       </w:r>
       <w:r>
-        <w:t xml:space="preserve"> a lo que hago aquí en el laboratorio donde hago prácticas. Las instrucciones son un poco confusas</w:t>
+        <w:t xml:space="preserve"> a lo que hago aquí en el laboratorio donde hago prácticas. Las instrucciones son un poco </w:t>
+      </w:r>
+      <w:r>
+        <w:t>confusas,</w:t>
       </w:r>
       <w:r>
         <w:t xml:space="preserve"> pero entiendo la idea de la tarea. Es ponerme a comparar mi evolución funcional dentro de la organización.</w:t>
@@ -2675,156 +2677,174 @@
     </w:p>
     <w:p>
       <w:r>
-        <w:t>Pero que mis actividades y responsabilidades no hayan cambiado no significa que mi papel dentro del laboratorio sea el mismo que cuando inicié. Si bien no cambié de título o cargo, sí terminé por crecer en otros aspectos, tanto profesionales como personales y de eso voy a hablar a continuación.</w:t>
+        <w:t xml:space="preserve">Pero que mis actividades y responsabilidades no hayan cambiado no significa que mi papel dentro del laboratorio sea el mismo que cuando inicié. </w:t>
       </w:r>
-      <w:bookmarkStart w:id="0" w:name="_GoBack"/>
-      <w:bookmarkEnd w:id="0"/>
       <w:r>
-        <w:t xml:space="preserve"> </w:t>
+        <w:t xml:space="preserve">Después de todo, todos pasamos por una semana de introducción y capacitación que nos distinguió mucho del personal de laboratorio que estaba antes de nosotros que ya sabía hacer las cosas. Nosotros pasamos de ser educandos a educadores en ese aspecto. Y así en muchos aspectos, es bastante obvio que al iniciar en el laboratorio nuestro papel era otro. Adquirir habilidades era necesario pero de todas formas hubiera sido inevitable tomando en cuenta que nunca dejamos de intentar nuevas cosas e involucrarnos en los proyectos de otros compañeros. </w:t>
       </w:r>
     </w:p>
     <w:p>
-      <w:pPr>
-        <w:pStyle w:val="Prrafodelista"/>
-        <w:numPr>
-          <w:ilvl w:val="0"/>
-          <w:numId w:val="7"/>
-        </w:numPr>
-      </w:pPr>
       <w:r>
-        <w:t>Incluye mínimo tres de las actividades que realiza en las prácticas profesionales. </w:t>
+        <w:t>A sí mismo, otros compañeros también se involucraron de forma participativa y eficiente en el proyecto que nos fue asignado a mí y a otro compañero. Lo que hizo más ágil el proceso de evolución en cuanto a habilidades.</w:t>
       </w:r>
     </w:p>
     <w:p>
-      <w:pPr>
-        <w:pStyle w:val="Prrafodelista"/>
-        <w:numPr>
-          <w:ilvl w:val="0"/>
-          <w:numId w:val="7"/>
-        </w:numPr>
-      </w:pPr>
       <w:r>
-        <w:t>Relaciona las actividades antes enumeradas, con los aprendizajes adquiridos durante su carrera.</w:t>
+        <w:t xml:space="preserve">Si bien no cambié de título o cargo, sí terminé por crecer en otros aspectos, tanto profesionales como personales y de eso voy a hablar a continuación. </w:t>
       </w:r>
     </w:p>
     <w:p>
       <w:pPr>
-        <w:pStyle w:val="Prrafodelista"/>
-        <w:numPr>
-          <w:ilvl w:val="0"/>
-          <w:numId w:val="7"/>
-        </w:numPr>
+        <w:spacing w:after="160" w:line="259" w:lineRule="auto"/>
       </w:pPr>
       <w:r>
-        <w:t>Relaciona las actividades con alguna norma, procedimiento o ley vigente.</w:t>
+        <w:br w:type="page"/>
       </w:r>
     </w:p>
     <w:p>
       <w:pPr>
-        <w:pStyle w:val="Prrafodelista"/>
-        <w:numPr>
-          <w:ilvl w:val="0"/>
-          <w:numId w:val="7"/>
-        </w:numPr>
+        <w:spacing w:after="160" w:line="259" w:lineRule="auto"/>
       </w:pPr>
       <w:r>
-        <w:t>Describe similitudes y diferencias entre lo aprendido en la carrera y lo aplicado en las prácticas profesionales, por cada una de las actividades. </w:t>
+        <w:rPr>
+          <w:noProof/>
+        </w:rPr>
+        <w:lastRenderedPageBreak/>
+        <w:drawing>
+          <wp:anchor distT="0" distB="0" distL="114300" distR="114300" simplePos="0" relativeHeight="251678720" behindDoc="1" locked="0" layoutInCell="1" allowOverlap="1" wp14:anchorId="53EB4223" wp14:editId="5E35B2EF">
+            <wp:simplePos x="0" y="0"/>
+            <wp:positionH relativeFrom="page">
+              <wp:align>right</wp:align>
+            </wp:positionH>
+            <wp:positionV relativeFrom="page">
+              <wp:align>top</wp:align>
+            </wp:positionV>
+            <wp:extent cx="7772400" cy="10306685"/>
+            <wp:effectExtent l="0" t="0" r="0" b="0"/>
+            <wp:wrapNone/>
+            <wp:docPr id="1015065065" name="Imagen 23"/>
+            <wp:cNvGraphicFramePr>
+              <a:graphicFrameLocks xmlns:a="http://schemas.openxmlformats.org/drawingml/2006/main" noChangeAspect="1"/>
+            </wp:cNvGraphicFramePr>
+            <a:graphic xmlns:a="http://schemas.openxmlformats.org/drawingml/2006/main">
+              <a:graphicData uri="http://schemas.openxmlformats.org/drawingml/2006/picture">
+                <pic:pic xmlns:pic="http://schemas.openxmlformats.org/drawingml/2006/picture">
+                  <pic:nvPicPr>
+                    <pic:cNvPr id="0" name="Picture 1"/>
+                    <pic:cNvPicPr>
+                      <a:picLocks noChangeAspect="1" noChangeArrowheads="1"/>
+                    </pic:cNvPicPr>
+                  </pic:nvPicPr>
+                  <pic:blipFill>
+                    <a:blip r:embed="rId8">
+                      <a:extLst>
+                        <a:ext uri="{28A0092B-C50C-407E-A947-70E740481C1C}">
+                          <a14:useLocalDpi xmlns:a14="http://schemas.microsoft.com/office/drawing/2010/main" val="0"/>
+                        </a:ext>
+                      </a:extLst>
+                    </a:blip>
+                    <a:srcRect/>
+                    <a:stretch>
+                      <a:fillRect/>
+                    </a:stretch>
+                  </pic:blipFill>
+                  <pic:spPr bwMode="auto">
+                    <a:xfrm>
+                      <a:off x="0" y="0"/>
+                      <a:ext cx="7772400" cy="10306685"/>
+                    </a:xfrm>
+                    <a:prstGeom prst="rect">
+                      <a:avLst/>
+                    </a:prstGeom>
+                    <a:noFill/>
+                    <a:ln>
+                      <a:noFill/>
+                    </a:ln>
+                  </pic:spPr>
+                </pic:pic>
+              </a:graphicData>
+            </a:graphic>
+            <wp14:sizeRelH relativeFrom="margin">
+              <wp14:pctWidth>0</wp14:pctWidth>
+            </wp14:sizeRelH>
+            <wp14:sizeRelV relativeFrom="margin">
+              <wp14:pctHeight>0</wp14:pctHeight>
+            </wp14:sizeRelV>
+          </wp:anchor>
+        </w:drawing>
+      </w:r>
+      <w:r>
+        <w:br w:type="page"/>
       </w:r>
     </w:p>
     <w:p>
       <w:pPr>
-        <w:pStyle w:val="Prrafodelista"/>
-        <w:numPr>
-          <w:ilvl w:val="0"/>
-          <w:numId w:val="7"/>
-        </w:numPr>
+        <w:spacing w:after="160" w:line="259" w:lineRule="auto"/>
+      </w:pPr>
+    </w:p>
+    <w:p>
+      <w:pPr>
+        <w:spacing w:after="160" w:line="259" w:lineRule="auto"/>
+        <w:rPr>
+          <w:rFonts w:ascii="Delight Candles" w:hAnsi="Delight Candles"/>
+          <w:color w:val="7030A0"/>
+          <w:sz w:val="24"/>
+        </w:rPr>
       </w:pPr>
       <w:r>
-        <w:t>Utiliza un cuadro comparativo de doble entrada</w:t>
+        <w:rPr>
+          <w:rFonts w:ascii="Delight Candles" w:hAnsi="Delight Candles"/>
+          <w:color w:val="7030A0"/>
+          <w:sz w:val="24"/>
+        </w:rPr>
+        <w:t>Conclusión</w:t>
       </w:r>
     </w:p>
     <w:p>
       <w:pPr>
-        <w:pStyle w:val="Prrafodelista"/>
-        <w:numPr>
-          <w:ilvl w:val="0"/>
-          <w:numId w:val="7"/>
-        </w:numPr>
+        <w:spacing w:after="160" w:line="259" w:lineRule="auto"/>
       </w:pPr>
       <w:r>
-        <w:t>Determina en la Columna 1 la actividad, Columna 2 lo logrado/no logrado y Columna 3 las similitudes/diferencias. Columna 4 las normas y procedimientos. </w:t>
+        <w:t>A lo largo de mi estancia en el laboratorio como practicante, fui desarrollando habilidades sin querer, como es inevitable en cualquier área donde uno se desarrolle. Sin embargo, mi idea de lo que iba a hacer en prácticas es muy diferente a la que terminé haciendo. Lo que no consideraré como una mala señal. Sobre todo porque aprendí a hacer cosas y eso siempre es una buena señal.</w:t>
       </w:r>
     </w:p>
     <w:p>
       <w:pPr>
-        <w:pStyle w:val="Prrafodelista"/>
-        <w:numPr>
-          <w:ilvl w:val="0"/>
-          <w:numId w:val="7"/>
-        </w:numPr>
+        <w:spacing w:after="160" w:line="259" w:lineRule="auto"/>
       </w:pPr>
       <w:r>
-        <w:t>Determina en cada fila la actividad desarrollada. </w:t>
+        <w:t xml:space="preserve">Al principio cuando inicié las prácticas profesionales se me hizo un poco incómodo la idea de que no recibiría un sueldo pero lo tuve en cuenta como algo justo considerando que no sabía hacer nada realmente y no tenía tanto que aportar al laboratorio. Mi paga era la experiencia y actualmente puedo decir con confianza que agarré una experiencia enriquecedora. </w:t>
       </w:r>
     </w:p>
     <w:p>
       <w:pPr>
-        <w:pStyle w:val="Prrafodelista"/>
-        <w:numPr>
-          <w:ilvl w:val="0"/>
-          <w:numId w:val="7"/>
-        </w:numPr>
+        <w:spacing w:after="160" w:line="259" w:lineRule="auto"/>
       </w:pPr>
       <w:r>
-        <w:t>Redacta sin cometer faltas de ortografía</w:t>
+        <w:t xml:space="preserve">No sólo superé el miedo a hacer cosa que no suelo hacer, también </w:t>
+      </w:r>
+      <w:r>
+        <w:t xml:space="preserve">aprendí (casi por accidente) a hacer otras cosas y terminé aprendiendo más de lo que pensé que iba a aprender en un periodo tan corto. Hice un proyecto con éxito por mi cuenta y eso es bastante valioso. Porque no tuve que quedarme en mi zona de confort aspirando a poder manejar los problemas con las habilidades, si no que aprendí a solventarlos con nuevas habilidades que se me fueron requeridas. </w:t>
       </w:r>
     </w:p>
     <w:p>
       <w:pPr>
-        <w:pStyle w:val="Prrafodelista"/>
-        <w:numPr>
-          <w:ilvl w:val="0"/>
-          <w:numId w:val="7"/>
-        </w:numPr>
+        <w:spacing w:after="160" w:line="259" w:lineRule="auto"/>
       </w:pPr>
       <w:r>
-        <w:t>Desarrolla en máximo 2 cuartillas. </w:t>
+        <w:t xml:space="preserve">Es lo importante de las prácticas profesionales, pero diría que en general de todo el proceso académico, es lo más importante de la escuela, poder aprovechar cada oportunidad para avanzar. Pero detrás de esa sensación de progreso siempre hubo una sensación de presión. A veces externa pero a veces a mí intrínsecamente me hacía sentir presionado no poder avanzar  tanto como hubiera querido porque cualquier pausa, no era una pausa, era un retroceso. </w:t>
+      </w:r>
+      <w:r>
+        <w:br/>
+        <w:t xml:space="preserve">Cuando se trata de adquirir nuevas habilidades y hacerse responsable de entregas, el descanso no es una opción y siempre habrá algo que cambiar. </w:t>
       </w:r>
     </w:p>
     <w:p>
       <w:pPr>
-        <w:pStyle w:val="Prrafodelista"/>
-        <w:numPr>
-          <w:ilvl w:val="0"/>
-          <w:numId w:val="7"/>
-        </w:numPr>
+        <w:spacing w:after="160" w:line="259" w:lineRule="auto"/>
       </w:pPr>
       <w:r>
-        <w:t>Buena presentación</w:t>
-      </w:r>
-    </w:p>
-    <w:p>
-      <w:pPr>
-        <w:pStyle w:val="Prrafodelista"/>
-        <w:numPr>
-          <w:ilvl w:val="0"/>
-          <w:numId w:val="7"/>
-        </w:numPr>
-      </w:pPr>
-      <w:r>
-        <w:t>Presenta con la estructura siguiente: portada institucional, introducción, contenido, conclusión.</w:t>
-      </w:r>
-    </w:p>
-    <w:p>
-      <w:pPr>
-        <w:pStyle w:val="Prrafodelista"/>
-        <w:numPr>
-          <w:ilvl w:val="0"/>
-          <w:numId w:val="7"/>
-        </w:numPr>
-      </w:pPr>
-      <w:r>
-        <w:t>Entrega en tiempo y forma.</w:t>
+        <w:t>Haber adquirido habilidades a lo largo de las prácticas profesionales no fue un privilegio, era lo mínimo que se esperaba de mí en esta carrera. Que supiera estar a la altura de las condiciones bajo las que me encontraba. Que no retrocediera. En esta carrera, uno debe avanzar tanto como pueda para mantenerse en el mismo lugar.</w:t>
       </w:r>
     </w:p>
     <w:p/>
@@ -2839,7 +2859,7 @@
 </file>
 
 <file path=word/endnotes.xml><?xml version="1.0" encoding="utf-8"?>
-<w:endnotes xmlns:wpc="http://schemas.microsoft.com/office/word/2010/wordprocessingCanvas" xmlns:mc="http://schemas.openxmlformats.org/markup-compatibility/2006" xmlns:o="urn:schemas-microsoft-com:office:office" xmlns:r="http://schemas.openxmlformats.org/officeDocument/2006/relationships" xmlns:m="http://schemas.openxmlformats.org/officeDocument/2006/math" xmlns:v="urn:schemas-microsoft-com:vml" xmlns:wp14="http://schemas.microsoft.com/office/word/2010/wordprocessingDrawing" xmlns:wp="http://schemas.openxmlformats.org/drawingml/2006/wordprocessingDrawing" xmlns:w10="urn:schemas-microsoft-com:office:word" xmlns:w="http://schemas.openxmlformats.org/wordprocessingml/2006/main" xmlns:w14="http://schemas.microsoft.com/office/word/2010/wordml" xmlns:w15="http://schemas.microsoft.com/office/word/2012/wordml" xmlns:wpg="http://schemas.microsoft.com/office/word/2010/wordprocessingGroup" xmlns:wpi="http://schemas.microsoft.com/office/word/2010/wordprocessingInk" xmlns:wne="http://schemas.microsoft.com/office/word/2006/wordml" xmlns:wps="http://schemas.microsoft.com/office/word/2010/wordprocessingShape" mc:Ignorable="w14 w15 wp14">
+<w:endnotes xmlns:wpc="http://schemas.microsoft.com/office/word/2010/wordprocessingCanvas" xmlns:cx="http://schemas.microsoft.com/office/drawing/2014/chartex" xmlns:cx1="http://schemas.microsoft.com/office/drawing/2015/9/8/chartex" xmlns:cx2="http://schemas.microsoft.com/office/drawing/2015/10/21/chartex" xmlns:cx3="http://schemas.microsoft.com/office/drawing/2016/5/9/chartex" xmlns:cx4="http://schemas.microsoft.com/office/drawing/2016/5/10/chartex" xmlns:cx5="http://schemas.microsoft.com/office/drawing/2016/5/11/chartex" xmlns:cx6="http://schemas.microsoft.com/office/drawing/2016/5/12/chartex" xmlns:cx7="http://schemas.microsoft.com/office/drawing/2016/5/13/chartex" xmlns:cx8="http://schemas.microsoft.com/office/drawing/2016/5/14/chartex" xmlns:mc="http://schemas.openxmlformats.org/markup-compatibility/2006" xmlns:aink="http://schemas.microsoft.com/office/drawing/2016/ink" xmlns:am3d="http://schemas.microsoft.com/office/drawing/2017/model3d" xmlns:o="urn:schemas-microsoft-com:office:office" xmlns:oel="http://schemas.microsoft.com/office/2019/extlst" xmlns:r="http://schemas.openxmlformats.org/officeDocument/2006/relationships" xmlns:m="http://schemas.openxmlformats.org/officeDocument/2006/math" xmlns:v="urn:schemas-microsoft-com:vml" xmlns:wp14="http://schemas.microsoft.com/office/word/2010/wordprocessingDrawing" xmlns:wp="http://schemas.openxmlformats.org/drawingml/2006/wordprocessingDrawing" xmlns:w10="urn:schemas-microsoft-com:office:word" xmlns:w="http://schemas.openxmlformats.org/wordprocessingml/2006/main" xmlns:w14="http://schemas.microsoft.com/office/word/2010/wordml" xmlns:w15="http://schemas.microsoft.com/office/word/2012/wordml" xmlns:w16cex="http://schemas.microsoft.com/office/word/2018/wordml/cex" xmlns:w16cid="http://schemas.microsoft.com/office/word/2016/wordml/cid" xmlns:w16="http://schemas.microsoft.com/office/word/2018/wordml" xmlns:w16du="http://schemas.microsoft.com/office/word/2023/wordml/word16du" xmlns:w16sdtdh="http://schemas.microsoft.com/office/word/2020/wordml/sdtdatahash" xmlns:w16sdtfl="http://schemas.microsoft.com/office/word/2024/wordml/sdtformatlock" xmlns:w16se="http://schemas.microsoft.com/office/word/2015/wordml/symex" xmlns:wpg="http://schemas.microsoft.com/office/word/2010/wordprocessingGroup" xmlns:wpi="http://schemas.microsoft.com/office/word/2010/wordprocessingInk" xmlns:wne="http://schemas.microsoft.com/office/word/2006/wordml" xmlns:wps="http://schemas.microsoft.com/office/word/2010/wordprocessingShape" mc:Ignorable="w14 w15 w16se w16cid w16 w16cex w16sdtdh w16sdtfl w16du wp14">
   <w:endnote w:type="separator" w:id="-1">
     <w:p>
       <w:pPr>
@@ -2864,7 +2884,7 @@
 </file>
 
 <file path=word/footnotes.xml><?xml version="1.0" encoding="utf-8"?>
-<w:footnotes xmlns:wpc="http://schemas.microsoft.com/office/word/2010/wordprocessingCanvas" xmlns:mc="http://schemas.openxmlformats.org/markup-compatibility/2006" xmlns:o="urn:schemas-microsoft-com:office:office" xmlns:r="http://schemas.openxmlformats.org/officeDocument/2006/relationships" xmlns:m="http://schemas.openxmlformats.org/officeDocument/2006/math" xmlns:v="urn:schemas-microsoft-com:vml" xmlns:wp14="http://schemas.microsoft.com/office/word/2010/wordprocessingDrawing" xmlns:wp="http://schemas.openxmlformats.org/drawingml/2006/wordprocessingDrawing" xmlns:w10="urn:schemas-microsoft-com:office:word" xmlns:w="http://schemas.openxmlformats.org/wordprocessingml/2006/main" xmlns:w14="http://schemas.microsoft.com/office/word/2010/wordml" xmlns:w15="http://schemas.microsoft.com/office/word/2012/wordml" xmlns:wpg="http://schemas.microsoft.com/office/word/2010/wordprocessingGroup" xmlns:wpi="http://schemas.microsoft.com/office/word/2010/wordprocessingInk" xmlns:wne="http://schemas.microsoft.com/office/word/2006/wordml" xmlns:wps="http://schemas.microsoft.com/office/word/2010/wordprocessingShape" mc:Ignorable="w14 w15 wp14">
+<w:footnotes xmlns:wpc="http://schemas.microsoft.com/office/word/2010/wordprocessingCanvas" xmlns:cx="http://schemas.microsoft.com/office/drawing/2014/chartex" xmlns:cx1="http://schemas.microsoft.com/office/drawing/2015/9/8/chartex" xmlns:cx2="http://schemas.microsoft.com/office/drawing/2015/10/21/chartex" xmlns:cx3="http://schemas.microsoft.com/office/drawing/2016/5/9/chartex" xmlns:cx4="http://schemas.microsoft.com/office/drawing/2016/5/10/chartex" xmlns:cx5="http://schemas.microsoft.com/office/drawing/2016/5/11/chartex" xmlns:cx6="http://schemas.microsoft.com/office/drawing/2016/5/12/chartex" xmlns:cx7="http://schemas.microsoft.com/office/drawing/2016/5/13/chartex" xmlns:cx8="http://schemas.microsoft.com/office/drawing/2016/5/14/chartex" xmlns:mc="http://schemas.openxmlformats.org/markup-compatibility/2006" xmlns:aink="http://schemas.microsoft.com/office/drawing/2016/ink" xmlns:am3d="http://schemas.microsoft.com/office/drawing/2017/model3d" xmlns:o="urn:schemas-microsoft-com:office:office" xmlns:oel="http://schemas.microsoft.com/office/2019/extlst" xmlns:r="http://schemas.openxmlformats.org/officeDocument/2006/relationships" xmlns:m="http://schemas.openxmlformats.org/officeDocument/2006/math" xmlns:v="urn:schemas-microsoft-com:vml" xmlns:wp14="http://schemas.microsoft.com/office/word/2010/wordprocessingDrawing" xmlns:wp="http://schemas.openxmlformats.org/drawingml/2006/wordprocessingDrawing" xmlns:w10="urn:schemas-microsoft-com:office:word" xmlns:w="http://schemas.openxmlformats.org/wordprocessingml/2006/main" xmlns:w14="http://schemas.microsoft.com/office/word/2010/wordml" xmlns:w15="http://schemas.microsoft.com/office/word/2012/wordml" xmlns:w16cex="http://schemas.microsoft.com/office/word/2018/wordml/cex" xmlns:w16cid="http://schemas.microsoft.com/office/word/2016/wordml/cid" xmlns:w16="http://schemas.microsoft.com/office/word/2018/wordml" xmlns:w16du="http://schemas.microsoft.com/office/word/2023/wordml/word16du" xmlns:w16sdtdh="http://schemas.microsoft.com/office/word/2020/wordml/sdtdatahash" xmlns:w16sdtfl="http://schemas.microsoft.com/office/word/2024/wordml/sdtformatlock" xmlns:w16se="http://schemas.microsoft.com/office/word/2015/wordml/symex" xmlns:wpg="http://schemas.microsoft.com/office/word/2010/wordprocessingGroup" xmlns:wpi="http://schemas.microsoft.com/office/word/2010/wordprocessingInk" xmlns:wne="http://schemas.microsoft.com/office/word/2006/wordml" xmlns:wps="http://schemas.microsoft.com/office/word/2010/wordprocessingShape" mc:Ignorable="w14 w15 w16se w16cid w16 w16cex w16sdtdh w16sdtfl w16du wp14">
   <w:footnote w:type="separator" w:id="-1">
     <w:p>
       <w:pPr>
@@ -2889,8 +2909,8 @@
 </file>
 
 <file path=word/numbering.xml><?xml version="1.0" encoding="utf-8"?>
-<w:numbering xmlns:wpc="http://schemas.microsoft.com/office/word/2010/wordprocessingCanvas" xmlns:mc="http://schemas.openxmlformats.org/markup-compatibility/2006" xmlns:o="urn:schemas-microsoft-com:office:office" xmlns:r="http://schemas.openxmlformats.org/officeDocument/2006/relationships" xmlns:m="http://schemas.openxmlformats.org/officeDocument/2006/math" xmlns:v="urn:schemas-microsoft-com:vml" xmlns:wp14="http://schemas.microsoft.com/office/word/2010/wordprocessingDrawing" xmlns:wp="http://schemas.openxmlformats.org/drawingml/2006/wordprocessingDrawing" xmlns:w10="urn:schemas-microsoft-com:office:word" xmlns:w="http://schemas.openxmlformats.org/wordprocessingml/2006/main" xmlns:w14="http://schemas.microsoft.com/office/word/2010/wordml" xmlns:w15="http://schemas.microsoft.com/office/word/2012/wordml" xmlns:wpg="http://schemas.microsoft.com/office/word/2010/wordprocessingGroup" xmlns:wpi="http://schemas.microsoft.com/office/word/2010/wordprocessingInk" xmlns:wne="http://schemas.microsoft.com/office/word/2006/wordml" xmlns:wps="http://schemas.microsoft.com/office/word/2010/wordprocessingShape" mc:Ignorable="w14 w15 wp14">
-  <w:abstractNum w:abstractNumId="0">
+<w:numbering xmlns:wpc="http://schemas.microsoft.com/office/word/2010/wordprocessingCanvas" xmlns:cx="http://schemas.microsoft.com/office/drawing/2014/chartex" xmlns:cx1="http://schemas.microsoft.com/office/drawing/2015/9/8/chartex" xmlns:cx2="http://schemas.microsoft.com/office/drawing/2015/10/21/chartex" xmlns:cx3="http://schemas.microsoft.com/office/drawing/2016/5/9/chartex" xmlns:cx4="http://schemas.microsoft.com/office/drawing/2016/5/10/chartex" xmlns:cx5="http://schemas.microsoft.com/office/drawing/2016/5/11/chartex" xmlns:cx6="http://schemas.microsoft.com/office/drawing/2016/5/12/chartex" xmlns:cx7="http://schemas.microsoft.com/office/drawing/2016/5/13/chartex" xmlns:cx8="http://schemas.microsoft.com/office/drawing/2016/5/14/chartex" xmlns:mc="http://schemas.openxmlformats.org/markup-compatibility/2006" xmlns:aink="http://schemas.microsoft.com/office/drawing/2016/ink" xmlns:am3d="http://schemas.microsoft.com/office/drawing/2017/model3d" xmlns:o="urn:schemas-microsoft-com:office:office" xmlns:oel="http://schemas.microsoft.com/office/2019/extlst" xmlns:r="http://schemas.openxmlformats.org/officeDocument/2006/relationships" xmlns:m="http://schemas.openxmlformats.org/officeDocument/2006/math" xmlns:v="urn:schemas-microsoft-com:vml" xmlns:wp14="http://schemas.microsoft.com/office/word/2010/wordprocessingDrawing" xmlns:wp="http://schemas.openxmlformats.org/drawingml/2006/wordprocessingDrawing" xmlns:w10="urn:schemas-microsoft-com:office:word" xmlns:w="http://schemas.openxmlformats.org/wordprocessingml/2006/main" xmlns:w14="http://schemas.microsoft.com/office/word/2010/wordml" xmlns:w15="http://schemas.microsoft.com/office/word/2012/wordml" xmlns:w16cex="http://schemas.microsoft.com/office/word/2018/wordml/cex" xmlns:w16cid="http://schemas.microsoft.com/office/word/2016/wordml/cid" xmlns:w16="http://schemas.microsoft.com/office/word/2018/wordml" xmlns:w16du="http://schemas.microsoft.com/office/word/2023/wordml/word16du" xmlns:w16sdtdh="http://schemas.microsoft.com/office/word/2020/wordml/sdtdatahash" xmlns:w16sdtfl="http://schemas.microsoft.com/office/word/2024/wordml/sdtformatlock" xmlns:w16se="http://schemas.microsoft.com/office/word/2015/wordml/symex" xmlns:wpg="http://schemas.microsoft.com/office/word/2010/wordprocessingGroup" xmlns:wpi="http://schemas.microsoft.com/office/word/2010/wordprocessingInk" xmlns:wne="http://schemas.microsoft.com/office/word/2006/wordml" xmlns:wps="http://schemas.microsoft.com/office/word/2010/wordprocessingShape" mc:Ignorable="w14 w15 w16se w16cid w16 w16cex w16sdtdh w16sdtfl w16du wp14">
+  <w:abstractNum w:abstractNumId="0" w15:restartNumberingAfterBreak="0">
     <w:nsid w:val="112917C9"/>
     <w:multiLevelType w:val="multilevel"/>
     <w:tmpl w:val="45983508"/>
@@ -3039,7 +3059,7 @@
       </w:rPr>
     </w:lvl>
   </w:abstractNum>
-  <w:abstractNum w:abstractNumId="1">
+  <w:abstractNum w:abstractNumId="1" w15:restartNumberingAfterBreak="0">
     <w:nsid w:val="1A167B5B"/>
     <w:multiLevelType w:val="hybridMultilevel"/>
     <w:tmpl w:val="29BEA202"/>
@@ -3152,7 +3172,7 @@
       </w:rPr>
     </w:lvl>
   </w:abstractNum>
-  <w:abstractNum w:abstractNumId="2">
+  <w:abstractNum w:abstractNumId="2" w15:restartNumberingAfterBreak="0">
     <w:nsid w:val="1C0365D8"/>
     <w:multiLevelType w:val="hybridMultilevel"/>
     <w:tmpl w:val="B4B2A89A"/>
@@ -3265,7 +3285,7 @@
       </w:rPr>
     </w:lvl>
   </w:abstractNum>
-  <w:abstractNum w:abstractNumId="3">
+  <w:abstractNum w:abstractNumId="3" w15:restartNumberingAfterBreak="0">
     <w:nsid w:val="49697592"/>
     <w:multiLevelType w:val="hybridMultilevel"/>
     <w:tmpl w:val="8ABA6186"/>
@@ -3378,7 +3398,7 @@
       </w:rPr>
     </w:lvl>
   </w:abstractNum>
-  <w:abstractNum w:abstractNumId="4">
+  <w:abstractNum w:abstractNumId="4" w15:restartNumberingAfterBreak="0">
     <w:nsid w:val="4A0309E8"/>
     <w:multiLevelType w:val="hybridMultilevel"/>
     <w:tmpl w:val="6CF6B96C"/>
@@ -3491,7 +3511,7 @@
       </w:rPr>
     </w:lvl>
   </w:abstractNum>
-  <w:abstractNum w:abstractNumId="5">
+  <w:abstractNum w:abstractNumId="5" w15:restartNumberingAfterBreak="0">
     <w:nsid w:val="4E8C2133"/>
     <w:multiLevelType w:val="hybridMultilevel"/>
     <w:tmpl w:val="A17A3900"/>
@@ -3604,7 +3624,7 @@
       </w:rPr>
     </w:lvl>
   </w:abstractNum>
-  <w:abstractNum w:abstractNumId="6">
+  <w:abstractNum w:abstractNumId="6" w15:restartNumberingAfterBreak="0">
     <w:nsid w:val="52E318FC"/>
     <w:multiLevelType w:val="hybridMultilevel"/>
     <w:tmpl w:val="7E1C5470"/>
@@ -3717,32 +3737,32 @@
       </w:rPr>
     </w:lvl>
   </w:abstractNum>
-  <w:num w:numId="1">
+  <w:num w:numId="1" w16cid:durableId="2132937836">
     <w:abstractNumId w:val="1"/>
   </w:num>
-  <w:num w:numId="2">
+  <w:num w:numId="2" w16cid:durableId="444009598">
     <w:abstractNumId w:val="3"/>
   </w:num>
-  <w:num w:numId="3">
+  <w:num w:numId="3" w16cid:durableId="1730498653">
     <w:abstractNumId w:val="5"/>
   </w:num>
-  <w:num w:numId="4">
+  <w:num w:numId="4" w16cid:durableId="1871331397">
     <w:abstractNumId w:val="2"/>
   </w:num>
-  <w:num w:numId="5">
+  <w:num w:numId="5" w16cid:durableId="1063411956">
     <w:abstractNumId w:val="4"/>
   </w:num>
-  <w:num w:numId="6">
+  <w:num w:numId="6" w16cid:durableId="1170758510">
     <w:abstractNumId w:val="0"/>
   </w:num>
-  <w:num w:numId="7">
+  <w:num w:numId="7" w16cid:durableId="1215310536">
     <w:abstractNumId w:val="6"/>
   </w:num>
 </w:numbering>
 </file>
 
 <file path=word/styles.xml><?xml version="1.0" encoding="utf-8"?>
-<w:styles xmlns:mc="http://schemas.openxmlformats.org/markup-compatibility/2006" xmlns:r="http://schemas.openxmlformats.org/officeDocument/2006/relationships" xmlns:w="http://schemas.openxmlformats.org/wordprocessingml/2006/main" xmlns:w14="http://schemas.microsoft.com/office/word/2010/wordml" xmlns:w15="http://schemas.microsoft.com/office/word/2012/wordml" mc:Ignorable="w14 w15">
+<w:styles xmlns:mc="http://schemas.openxmlformats.org/markup-compatibility/2006" xmlns:r="http://schemas.openxmlformats.org/officeDocument/2006/relationships" xmlns:w="http://schemas.openxmlformats.org/wordprocessingml/2006/main" xmlns:w14="http://schemas.microsoft.com/office/word/2010/wordml" xmlns:w15="http://schemas.microsoft.com/office/word/2012/wordml" xmlns:w16cex="http://schemas.microsoft.com/office/word/2018/wordml/cex" xmlns:w16cid="http://schemas.microsoft.com/office/word/2016/wordml/cid" xmlns:w16="http://schemas.microsoft.com/office/word/2018/wordml" xmlns:w16du="http://schemas.microsoft.com/office/word/2023/wordml/word16du" xmlns:w16sdtdh="http://schemas.microsoft.com/office/word/2020/wordml/sdtdatahash" xmlns:w16sdtfl="http://schemas.microsoft.com/office/word/2024/wordml/sdtformatlock" xmlns:w16se="http://schemas.microsoft.com/office/word/2015/wordml/symex" mc:Ignorable="w14 w15 w16se w16cid w16 w16cex w16sdtdh w16sdtfl w16du">
   <w:docDefaults>
     <w:rPrDefault>
       <w:rPr>
@@ -3758,7 +3778,7 @@
       </w:pPr>
     </w:pPrDefault>
   </w:docDefaults>
-  <w:latentStyles w:defLockedState="0" w:defUIPriority="99" w:defSemiHidden="0" w:defUnhideWhenUsed="0" w:defQFormat="0" w:count="371">
+  <w:latentStyles w:defLockedState="0" w:defUIPriority="99" w:defSemiHidden="0" w:defUnhideWhenUsed="0" w:defQFormat="0" w:count="376">
     <w:lsdException w:name="Normal" w:uiPriority="0" w:qFormat="1"/>
     <w:lsdException w:name="heading 1" w:uiPriority="9" w:qFormat="1"/>
     <w:lsdException w:name="heading 2" w:semiHidden="1" w:uiPriority="9" w:unhideWhenUsed="1" w:qFormat="1"/>
@@ -4130,6 +4150,11 @@
     <w:lsdException w:name="List Table 5 Dark Accent 6" w:uiPriority="50"/>
     <w:lsdException w:name="List Table 6 Colorful Accent 6" w:uiPriority="51"/>
     <w:lsdException w:name="List Table 7 Colorful Accent 6" w:uiPriority="52"/>
+    <w:lsdException w:name="Mention" w:semiHidden="1" w:unhideWhenUsed="1"/>
+    <w:lsdException w:name="Smart Hyperlink" w:semiHidden="1" w:unhideWhenUsed="1"/>
+    <w:lsdException w:name="Hashtag" w:semiHidden="1" w:unhideWhenUsed="1"/>
+    <w:lsdException w:name="Unresolved Mention" w:semiHidden="1" w:unhideWhenUsed="1"/>
+    <w:lsdException w:name="Smart Link" w:semiHidden="1" w:unhideWhenUsed="1"/>
   </w:latentStyles>
   <w:style w:type="paragraph" w:default="1" w:styleId="Normal">
     <w:name w:val="Normal"/>
@@ -4147,6 +4172,7 @@
   <w:style w:type="character" w:default="1" w:styleId="Fuentedeprrafopredeter">
     <w:name w:val="Default Paragraph Font"/>
     <w:uiPriority w:val="1"/>
+    <w:semiHidden/>
     <w:unhideWhenUsed/>
   </w:style>
   <w:style w:type="table" w:default="1" w:styleId="Tablanormal">
@@ -4234,6 +4260,112 @@
       <w:ind w:left="720"/>
       <w:contextualSpacing/>
     </w:pPr>
+  </w:style>
+  <w:style w:type="table" w:styleId="Tablaconcuadrcula5oscura-nfasis1">
+    <w:name w:val="Grid Table 5 Dark Accent 1"/>
+    <w:basedOn w:val="Tablanormal"/>
+    <w:uiPriority w:val="50"/>
+    <w:rsid w:val="003339D0"/>
+    <w:pPr>
+      <w:spacing w:after="0" w:line="240" w:lineRule="auto"/>
+    </w:pPr>
+    <w:tblPr>
+      <w:tblStyleRowBandSize w:val="1"/>
+      <w:tblStyleColBandSize w:val="1"/>
+      <w:tblBorders>
+        <w:top w:val="single" w:sz="4" w:space="0" w:color="FFFFFF" w:themeColor="background1"/>
+        <w:left w:val="single" w:sz="4" w:space="0" w:color="FFFFFF" w:themeColor="background1"/>
+        <w:bottom w:val="single" w:sz="4" w:space="0" w:color="FFFFFF" w:themeColor="background1"/>
+        <w:right w:val="single" w:sz="4" w:space="0" w:color="FFFFFF" w:themeColor="background1"/>
+        <w:insideH w:val="single" w:sz="4" w:space="0" w:color="FFFFFF" w:themeColor="background1"/>
+        <w:insideV w:val="single" w:sz="4" w:space="0" w:color="FFFFFF" w:themeColor="background1"/>
+      </w:tblBorders>
+    </w:tblPr>
+    <w:tcPr>
+      <w:shd w:val="clear" w:color="auto" w:fill="DEEAF6" w:themeFill="accent1" w:themeFillTint="33"/>
+    </w:tcPr>
+    <w:tblStylePr w:type="firstRow">
+      <w:rPr>
+        <w:b/>
+        <w:bCs/>
+        <w:color w:val="FFFFFF" w:themeColor="background1"/>
+      </w:rPr>
+      <w:tblPr/>
+      <w:tcPr>
+        <w:tcBorders>
+          <w:top w:val="single" w:sz="4" w:space="0" w:color="FFFFFF" w:themeColor="background1"/>
+          <w:left w:val="single" w:sz="4" w:space="0" w:color="FFFFFF" w:themeColor="background1"/>
+          <w:right w:val="single" w:sz="4" w:space="0" w:color="FFFFFF" w:themeColor="background1"/>
+          <w:insideH w:val="nil"/>
+          <w:insideV w:val="nil"/>
+        </w:tcBorders>
+        <w:shd w:val="clear" w:color="auto" w:fill="5B9BD5" w:themeFill="accent1"/>
+      </w:tcPr>
+    </w:tblStylePr>
+    <w:tblStylePr w:type="lastRow">
+      <w:rPr>
+        <w:b/>
+        <w:bCs/>
+        <w:color w:val="FFFFFF" w:themeColor="background1"/>
+      </w:rPr>
+      <w:tblPr/>
+      <w:tcPr>
+        <w:tcBorders>
+          <w:left w:val="single" w:sz="4" w:space="0" w:color="FFFFFF" w:themeColor="background1"/>
+          <w:bottom w:val="single" w:sz="4" w:space="0" w:color="FFFFFF" w:themeColor="background1"/>
+          <w:right w:val="single" w:sz="4" w:space="0" w:color="FFFFFF" w:themeColor="background1"/>
+          <w:insideH w:val="nil"/>
+          <w:insideV w:val="nil"/>
+        </w:tcBorders>
+        <w:shd w:val="clear" w:color="auto" w:fill="5B9BD5" w:themeFill="accent1"/>
+      </w:tcPr>
+    </w:tblStylePr>
+    <w:tblStylePr w:type="firstCol">
+      <w:rPr>
+        <w:b/>
+        <w:bCs/>
+        <w:color w:val="FFFFFF" w:themeColor="background1"/>
+      </w:rPr>
+      <w:tblPr/>
+      <w:tcPr>
+        <w:tcBorders>
+          <w:top w:val="single" w:sz="4" w:space="0" w:color="FFFFFF" w:themeColor="background1"/>
+          <w:left w:val="single" w:sz="4" w:space="0" w:color="FFFFFF" w:themeColor="background1"/>
+          <w:bottom w:val="single" w:sz="4" w:space="0" w:color="FFFFFF" w:themeColor="background1"/>
+          <w:insideV w:val="nil"/>
+        </w:tcBorders>
+        <w:shd w:val="clear" w:color="auto" w:fill="5B9BD5" w:themeFill="accent1"/>
+      </w:tcPr>
+    </w:tblStylePr>
+    <w:tblStylePr w:type="lastCol">
+      <w:rPr>
+        <w:b/>
+        <w:bCs/>
+        <w:color w:val="FFFFFF" w:themeColor="background1"/>
+      </w:rPr>
+      <w:tblPr/>
+      <w:tcPr>
+        <w:tcBorders>
+          <w:top w:val="single" w:sz="4" w:space="0" w:color="FFFFFF" w:themeColor="background1"/>
+          <w:bottom w:val="single" w:sz="4" w:space="0" w:color="FFFFFF" w:themeColor="background1"/>
+          <w:right w:val="single" w:sz="4" w:space="0" w:color="FFFFFF" w:themeColor="background1"/>
+          <w:insideV w:val="nil"/>
+        </w:tcBorders>
+        <w:shd w:val="clear" w:color="auto" w:fill="5B9BD5" w:themeFill="accent1"/>
+      </w:tcPr>
+    </w:tblStylePr>
+    <w:tblStylePr w:type="band1Vert">
+      <w:tblPr/>
+      <w:tcPr>
+        <w:shd w:val="clear" w:color="auto" w:fill="BDD6EE" w:themeFill="accent1" w:themeFillTint="66"/>
+      </w:tcPr>
+    </w:tblStylePr>
+    <w:tblStylePr w:type="band1Horz">
+      <w:tblPr/>
+      <w:tcPr>
+        <w:shd w:val="clear" w:color="auto" w:fill="BDD6EE" w:themeFill="accent1" w:themeFillTint="66"/>
+      </w:tcPr>
+    </w:tblStylePr>
   </w:style>
 </w:styles>
 </file>

</xml_diff>